<commit_message>
Hitamkan semua warna font isian Bagian I kecuali tautan bukti dukung
Seluruh teks isian (Sasaran, Target/Realisasi, Analisis Capaian, Kendala, Solusi,
RTL, Dasar Hitung, dst) sebelumnya berwarna biru (1F4E79) sama seperti dua tautan
bukti dukung (link folder Drive), jadi tidak ada beda visual antara isian biasa
dan tautan yang sungguhan bisa diklik. Diubah jadi hitam untuk 31 dari 33 run
berwarna, dua tautan bukti_realisasi/bukti_rtl_sebelumnya tetap biru.

Co-Authored-By: Claude Sonnet 5 <noreply@anthropic.com>
</commit_message>
<xml_diff>
--- a/template_notula/SIPINTER_Template_Bagian_I_Mesin.docx
+++ b/template_notula/SIPINTER_Template_Bagian_I_Mesin.docx
@@ -75,7 +75,7 @@
               <w:rPr>
                 <w:b w:val="0"/>
                 <w:i w:val="0"/>
-                <w:color w:val="1F4E79"/>
+                <w:color w:val="000000"/>
               </w:rPr>
               <w:t>Monitoring Kinerja Triwulan {{triwulan_angka}} Tahun {{tahun}}</w:t>
             </w:r>
@@ -108,7 +108,7 @@
               <w:rPr>
                 <w:b w:val="0"/>
                 <w:i w:val="0"/>
-                <w:color w:val="1F4E79"/>
+                <w:color w:val="000000"/>
               </w:rPr>
               <w:t>{{hari_tanggal}}</w:t>
             </w:r>
@@ -141,7 +141,7 @@
               <w:rPr>
                 <w:b w:val="0"/>
                 <w:i w:val="0"/>
-                <w:color w:val="1F4E79"/>
+                <w:color w:val="000000"/>
               </w:rPr>
               <w:t>{{waktu}}</w:t>
             </w:r>
@@ -174,7 +174,7 @@
               <w:rPr>
                 <w:b w:val="0"/>
                 <w:i w:val="0"/>
-                <w:color w:val="1F4E79"/>
+                <w:color w:val="000000"/>
               </w:rPr>
               <w:t>{{tempat}}</w:t>
             </w:r>
@@ -207,7 +207,7 @@
               <w:rPr>
                 <w:b w:val="0"/>
                 <w:i w:val="0"/>
-                <w:color w:val="1F4E79"/>
+                <w:color w:val="000000"/>
               </w:rPr>
               <w:t>{{pimpinan_rapat}}</w:t>
             </w:r>
@@ -231,7 +231,7 @@
       </w:r>
       <w:r>
         <w:rPr>
-          <w:color w:val="1F4E79"/>
+          <w:color w:val="000000"/>
         </w:rPr>
         <w:t>{{capaian_triwulanan_persen}}</w:t>
       </w:r>
@@ -240,7 +240,7 @@
       </w:r>
       <w:r>
         <w:rPr>
-          <w:color w:val="1F4E79"/>
+          <w:color w:val="000000"/>
         </w:rPr>
         <w:t>{{capaian_pk_persen}}</w:t>
       </w:r>
@@ -310,7 +310,7 @@
               <w:rPr>
                 <w:b w:val="0"/>
                 <w:i w:val="0"/>
-                <w:color w:val="1F4E79"/>
+                <w:color w:val="000000"/>
               </w:rPr>
               <w:t>{{sasaran}}</w:t>
             </w:r>
@@ -572,7 +572,7 @@
               <w:rPr>
                 <w:b w:val="0"/>
                 <w:i w:val="0"/>
-                <w:color w:val="1F4E79"/>
+                <w:color w:val="000000"/>
               </w:rPr>
               <w:t>{{target_pk}}</w:t>
             </w:r>
@@ -591,7 +591,7 @@
               <w:rPr>
                 <w:b w:val="0"/>
                 <w:i w:val="0"/>
-                <w:color w:val="1F4E79"/>
+                <w:color w:val="000000"/>
               </w:rPr>
               <w:t>{{target_tw}}</w:t>
             </w:r>
@@ -610,7 +610,7 @@
               <w:rPr>
                 <w:b w:val="0"/>
                 <w:i w:val="0"/>
-                <w:color w:val="1F4E79"/>
+                <w:color w:val="000000"/>
               </w:rPr>
               <w:t>{{realisasi_tw}}</w:t>
             </w:r>
@@ -629,7 +629,7 @@
               <w:rPr>
                 <w:b w:val="0"/>
                 <w:i w:val="0"/>
-                <w:color w:val="1F4E79"/>
+                <w:color w:val="000000"/>
               </w:rPr>
               <w:t>{{capaian_tw}}</w:t>
             </w:r>
@@ -648,7 +648,7 @@
               <w:rPr>
                 <w:b w:val="0"/>
                 <w:i w:val="0"/>
-                <w:color w:val="1F4E79"/>
+                <w:color w:val="000000"/>
               </w:rPr>
               <w:t>{{capaian_pk}}</w:t>
             </w:r>
@@ -689,7 +689,7 @@
               <w:rPr>
                 <w:b w:val="0"/>
                 <w:i w:val="0"/>
-                <w:color w:val="1F4E79"/>
+                <w:color w:val="000000"/>
               </w:rPr>
               <w:t>{{analisis_capaian}}</w:t>
             </w:r>
@@ -837,7 +837,7 @@
               <w:rPr>
                 <w:b w:val="0"/>
                 <w:i w:val="0"/>
-                <w:color w:val="1F4E79"/>
+                <w:color w:val="000000"/>
               </w:rPr>
               <w:t>{{ro_vol}}</w:t>
             </w:r>
@@ -854,7 +854,7 @@
               <w:rPr>
                 <w:b w:val="0"/>
                 <w:i w:val="0"/>
-                <w:color w:val="1F4E79"/>
+                <w:color w:val="000000"/>
               </w:rPr>
               <w:t>{{ro_progres}}</w:t>
             </w:r>
@@ -1015,7 +1015,7 @@
               <w:rPr>
                 <w:b w:val="0"/>
                 <w:i w:val="0"/>
-                <w:color w:val="1F4E79"/>
+                <w:color w:val="000000"/>
               </w:rPr>
               <w:t>{{target_proksi}}</w:t>
             </w:r>
@@ -1031,7 +1031,7 @@
               <w:rPr>
                 <w:b w:val="0"/>
                 <w:i w:val="0"/>
-                <w:color w:val="1F4E79"/>
+                <w:color w:val="000000"/>
               </w:rPr>
               <w:t>{{realisasi_proksi}}</w:t>
             </w:r>
@@ -1124,7 +1124,7 @@
               <w:rPr>
                 <w:b w:val="0"/>
                 <w:i w:val="0"/>
-                <w:color w:val="1F4E79"/>
+                <w:color w:val="000000"/>
               </w:rPr>
               <w:t>{{kendala}}</w:t>
             </w:r>
@@ -1150,7 +1150,7 @@
               <w:rPr>
                 <w:b w:val="0"/>
                 <w:i w:val="0"/>
-                <w:color w:val="1F4E79"/>
+                <w:color w:val="000000"/>
               </w:rPr>
               <w:t>{{solusi}}</w:t>
             </w:r>
@@ -1178,7 +1178,7 @@
               <w:rPr>
                 <w:b w:val="0"/>
                 <w:i w:val="0"/>
-                <w:color w:val="1F4E79"/>
+                <w:color w:val="000000"/>
               </w:rPr>
               <w:t>{{rtl}}</w:t>
             </w:r>
@@ -1204,7 +1204,7 @@
               <w:rPr>
                 <w:b w:val="0"/>
                 <w:i w:val="0"/>
-                <w:color w:val="1F4E79"/>
+                <w:color w:val="000000"/>
               </w:rPr>
               <w:t>{{pic_rtl}}</w:t>
             </w:r>
@@ -1223,7 +1223,7 @@
               <w:rPr>
                 <w:b w:val="0"/>
                 <w:i w:val="0"/>
-                <w:color w:val="1F4E79"/>
+                <w:color w:val="000000"/>
               </w:rPr>
               <w:t>{{batas_waktu_rtl}}</w:t>
             </w:r>
@@ -1281,7 +1281,7 @@
               <w:rPr>
                 <w:b w:val="0"/>
                 <w:i w:val="0"/>
-                <w:color w:val="1F4E79"/>
+                <w:color w:val="000000"/>
               </w:rPr>
               <w:t xml:space="preserve">{{formula_capaian}}</w:t>
             </w:r>
@@ -1297,7 +1297,7 @@
               <w:rPr>
                 <w:b w:val="0"/>
                 <w:i w:val="0"/>
-                <w:color w:val="1F4E79"/>
+                <w:color w:val="000000"/>
               </w:rPr>
               <w:t>{{dasar_hitung}}</w:t>
             </w:r>
@@ -1384,7 +1384,7 @@
               <w:rPr>
                 <w:b w:val="0"/>
                 <w:i w:val="0"/>
-                <w:color w:val="1F4E79"/>
+                <w:color w:val="000000"/>
               </w:rPr>
               <w:t>{{penjelasan_lainnya}}</w:t>
             </w:r>
@@ -1403,7 +1403,7 @@
       <w:r>
         <w:rPr>
           <w:i/>
-          <w:color w:val="1F4E79"/>
+          <w:color w:val="000000"/>
         </w:rPr>
         <w:t>{{bagian_2}}</w:t>
       </w:r>
@@ -1413,7 +1413,7 @@
       <w:r>
         <w:rPr>
           <w:i/>
-          <w:color w:val="1F4E79"/>
+          <w:color w:val="000000"/>
         </w:rPr>
         <w:t>{{bagian_3}}</w:t>
       </w:r>
@@ -1461,7 +1461,7 @@
               <w:rPr>
                 <w:b w:val="0"/>
                 <w:i w:val="0"/>
-                <w:color w:val="1F4E79"/>
+                <w:color w:val="000000"/>
               </w:rPr>
               <w:t>{{kota_tanggal_ttd}}</w:t>
             </w:r>
@@ -1550,7 +1550,7 @@
               <w:rPr>
                 <w:b w:val="0"/>
                 <w:i w:val="0"/>
-                <w:color w:val="1F4E79"/>
+                <w:color w:val="000000"/>
               </w:rPr>
               <w:t>{{ttd_kepala}}</w:t>
             </w:r>
@@ -1569,7 +1569,7 @@
               <w:rPr>
                 <w:b w:val="0"/>
                 <w:i w:val="0"/>
-                <w:color w:val="1F4E79"/>
+                <w:color w:val="000000"/>
               </w:rPr>
               <w:t>{{ttd_notulis}}</w:t>
             </w:r>

</xml_diff>

<commit_message>
Rumus pecahan bersusun asli di docx, rapikan tabel Realisasi RO & baris tabel
- Rumus Dasar Hitung IKU % di .docx kini pecahan bersusun sungguhan (OOXML
  Math m:f), bukan notasi n/N biasa -- App\Support\RumusMarkup::keOmml()
- Baris "n = 0 (belum ada item...)" dihilangkan total saat n=0, langsung
  lompat ke rincian N
- Setiap baris tabel Bagian I ditandai cantSplit supaya Word tidak
  memotongnya di tengah pada batas halaman (RO/Kegiatan/Kendala-Solusi tidak
  lagi tampak lepas dari nilainya sendiri)
- Hapus catatan merah instruksional dari template Realisasi Volume RO
- Tabel Realisasi Volume RO hanya tampil bila benar-benar ada RO yang sudah
  direalisasikan (volume_ro/progres_persen terisi), bukan cuma RO yang ada

Co-Authored-By: Claude Sonnet 5 <noreply@anthropic.com>
</commit_message>
<xml_diff>
--- a/template_notula/SIPINTER_Template_Bagian_I_Mesin.docx
+++ b/template_notula/SIPINTER_Template_Bagian_I_Mesin.docx
@@ -725,16 +725,6 @@
               <w:t xml:space="preserve">Realisasi Volume RO dan Progress Pelaksanaan Kegiatan sampai dengan Triwulan Berjalan : </w:t>
             </w:r>
           </w:p>
-          <w:p>
-            <w:r>
-              <w:rPr>
-                <w:b/>
-                <w:i/>
-                <w:color w:val="C00000"/>
-              </w:rPr>
-              <w:t>(Hanya terisi jika belum ada realisasi IKU pada triwulan berjalan. Jika realisasi IKU sudah ada, bagian ini dapat dihapuskan)</w:t>
-            </w:r>
-          </w:p>
         </w:tc>
       </w:tr>
       <w:tr>
@@ -916,16 +906,6 @@
               <w:t>Jelaskan mengenai persentase monitoring capaian kinerja triwulanan yang terlaksana tepat waktu :</w:t>
             </w:r>
           </w:p>
-          <w:p>
-            <w:r>
-              <w:rPr>
-                <w:b/>
-                <w:i/>
-                <w:color w:val="C00000"/>
-              </w:rPr>
-              <w:t>(Hanya terisi jika belum ada realisasi IKU pada triwulan berjalan. Jika realisasi IKU sudah ada, bagian ini dapat dihapuskan)</w:t>
-            </w:r>
-          </w:p>
         </w:tc>
       </w:tr>
       <w:tr>
@@ -1078,16 +1058,6 @@
                 <w:i w:val="0"/>
               </w:rPr>
               <w:t>Jelaskan mengenai Persentase kegiatan untuk mengoptimalkan implementasi BerAKHLAK yang terlaksana sesuai rencana :</w:t>
-            </w:r>
-          </w:p>
-          <w:p>
-            <w:r>
-              <w:rPr>
-                <w:b/>
-                <w:i/>
-                <w:color w:val="C00000"/>
-              </w:rPr>
-              <w:t>(Hanya terisi jika belum ada realisasi IKU pada triwulan berjalan. Jika realisasi IKU sudah ada, bagian ini dapat dihapuskan)</w:t>
             </w:r>
           </w:p>
         </w:tc>

</xml_diff>

<commit_message>
Tambah notasi sigma bersusun [[SUM:...|...]] di RumusMarkup
Melengkapi sintaks [[a|b]] pecahan bersusun yang sudah ada dengan
[[SUM:batas_bawah,batas_atas|suku]] untuk rumus IKU bersatuan Poin yang
memakai notasi sigma (mis. IPP), dirender bersusun sungguhan lewat OOXML
Math <m:nary> di .docx dan flex-column di HTML/PDF, sama seperti pecahan.
</commit_message>
<xml_diff>
--- a/template_notula/SIPINTER_Template_Bagian_I_Mesin.docx
+++ b/template_notula/SIPINTER_Template_Bagian_I_Mesin.docx
@@ -42,17 +42,18 @@
     <w:tbl>
       <w:tblPr>
         <w:tblStyle w:val="TableGrid"/>
-        <w:tblW w:type="auto" w:w="0"/>
+        <w:tblW w:type="dxa" w:w="9026"/>
         <w:tblLook w:firstColumn="1" w:firstRow="1" w:lastColumn="0" w:lastRow="0" w:noHBand="0" w:noVBand="1" w:val="04A0"/>
+        <w:tblLayout w:type="fixed"/>
       </w:tblPr>
       <w:tblGrid>
-        <w:gridCol w:w="4320"/>
-        <w:gridCol w:w="4320"/>
+        <w:gridCol w:w="1657"/>
+        <w:gridCol w:w="7369"/>
       </w:tblGrid>
       <w:tr>
         <w:tc>
           <w:tcPr>
-            <w:tcW w:type="dxa" w:w="4320"/>
+            <w:tcW w:type="dxa" w:w="1657"/>
           </w:tcPr>
           <w:p>
             <w:r/>
@@ -67,7 +68,7 @@
         </w:tc>
         <w:tc>
           <w:tcPr>
-            <w:tcW w:type="dxa" w:w="4320"/>
+            <w:tcW w:type="dxa" w:w="7369"/>
           </w:tcPr>
           <w:p>
             <w:r/>
@@ -85,7 +86,7 @@
       <w:tr>
         <w:tc>
           <w:tcPr>
-            <w:tcW w:type="dxa" w:w="4320"/>
+            <w:tcW w:type="dxa" w:w="1657"/>
           </w:tcPr>
           <w:p>
             <w:r/>
@@ -100,7 +101,7 @@
         </w:tc>
         <w:tc>
           <w:tcPr>
-            <w:tcW w:type="dxa" w:w="4320"/>
+            <w:tcW w:type="dxa" w:w="7369"/>
           </w:tcPr>
           <w:p>
             <w:r/>
@@ -118,7 +119,7 @@
       <w:tr>
         <w:tc>
           <w:tcPr>
-            <w:tcW w:type="dxa" w:w="4320"/>
+            <w:tcW w:type="dxa" w:w="1657"/>
           </w:tcPr>
           <w:p>
             <w:r/>
@@ -133,7 +134,7 @@
         </w:tc>
         <w:tc>
           <w:tcPr>
-            <w:tcW w:type="dxa" w:w="4320"/>
+            <w:tcW w:type="dxa" w:w="7369"/>
           </w:tcPr>
           <w:p>
             <w:r/>
@@ -151,7 +152,7 @@
       <w:tr>
         <w:tc>
           <w:tcPr>
-            <w:tcW w:type="dxa" w:w="4320"/>
+            <w:tcW w:type="dxa" w:w="1657"/>
           </w:tcPr>
           <w:p>
             <w:r/>
@@ -166,7 +167,7 @@
         </w:tc>
         <w:tc>
           <w:tcPr>
-            <w:tcW w:type="dxa" w:w="4320"/>
+            <w:tcW w:type="dxa" w:w="7369"/>
           </w:tcPr>
           <w:p>
             <w:r/>
@@ -184,7 +185,7 @@
       <w:tr>
         <w:tc>
           <w:tcPr>
-            <w:tcW w:type="dxa" w:w="4320"/>
+            <w:tcW w:type="dxa" w:w="1657"/>
           </w:tcPr>
           <w:p>
             <w:r/>
@@ -199,7 +200,7 @@
         </w:tc>
         <w:tc>
           <w:tcPr>
-            <w:tcW w:type="dxa" w:w="4320"/>
+            <w:tcW w:type="dxa" w:w="7369"/>
           </w:tcPr>
           <w:p>
             <w:r/>
@@ -257,23 +258,23 @@
     <w:tbl>
       <w:tblPr>
         <w:tblStyle w:val="TableGrid"/>
-        <w:tblW w:type="auto" w:w="0"/>
-        <w:jc w:val="center"/>
+        <w:tblW w:type="dxa" w:w="9026"/>
         <w:tblLook w:firstColumn="1" w:firstRow="1" w:lastColumn="0" w:lastRow="0" w:noHBand="0" w:noVBand="1" w:val="04A0"/>
+        <w:tblLayout w:type="fixed"/>
       </w:tblPr>
       <w:tblGrid>
-        <w:gridCol w:w="1234"/>
-        <w:gridCol w:w="1234"/>
-        <w:gridCol w:w="1234"/>
-        <w:gridCol w:w="1234"/>
-        <w:gridCol w:w="1234"/>
-        <w:gridCol w:w="1234"/>
-        <w:gridCol w:w="1234"/>
+        <w:gridCol w:w="1104"/>
+        <w:gridCol w:w="2087"/>
+        <w:gridCol w:w="972"/>
+        <w:gridCol w:w="973"/>
+        <w:gridCol w:w="1265"/>
+        <w:gridCol w:w="1529"/>
+        <w:gridCol w:w="1096"/>
       </w:tblGrid>
       <w:tr>
         <w:tc>
           <w:tcPr>
-            <w:tcW w:type="dxa" w:w="1234"/>
+            <w:tcW w:type="dxa" w:w="1104"/>
             <w:vAlign w:val="center"/>
             <w:shd w:val="clear" w:color="auto" w:fill="D9D9D9"/>
           </w:tcPr>
@@ -293,7 +294,7 @@
         </w:tc>
         <w:tc>
           <w:tcPr>
-            <w:tcW w:type="dxa" w:w="6170"/>
+            <w:tcW w:type="dxa" w:w="6826"/>
             <w:gridSpan w:val="5"/>
             <w:shd w:val="clear" w:color="auto" w:fill="D9D9D9"/>
           </w:tcPr>
@@ -318,7 +319,7 @@
         </w:tc>
         <w:tc>
           <w:tcPr>
-            <w:tcW w:type="dxa" w:w="1234"/>
+            <w:tcW w:type="dxa" w:w="1096"/>
             <w:shd w:val="clear" w:color="auto" w:fill="D9D9D9"/>
           </w:tcPr>
           <w:p>
@@ -335,7 +336,7 @@
       <w:tr>
         <w:tc>
           <w:tcPr>
-            <w:tcW w:type="dxa" w:w="1234"/>
+            <w:tcW w:type="dxa" w:w="1104"/>
             <w:vMerge w:val="restart"/>
             <w:vAlign w:val="center"/>
             <w:shd w:val="clear" w:color="auto" w:fill="F2F2F2"/>
@@ -356,7 +357,7 @@
         </w:tc>
         <w:tc>
           <w:tcPr>
-            <w:tcW w:type="dxa" w:w="1234"/>
+            <w:tcW w:type="dxa" w:w="2087"/>
             <w:vMerge w:val="restart"/>
             <w:vAlign w:val="center"/>
             <w:shd w:val="clear" w:color="auto" w:fill="F2F2F2"/>
@@ -377,7 +378,7 @@
         </w:tc>
         <w:tc>
           <w:tcPr>
-            <w:tcW w:type="dxa" w:w="1234"/>
+            <w:tcW w:type="dxa" w:w="972"/>
             <w:vMerge w:val="restart"/>
             <w:vAlign w:val="center"/>
             <w:shd w:val="clear" w:color="auto" w:fill="F2F2F2"/>
@@ -398,7 +399,7 @@
         </w:tc>
         <w:tc>
           <w:tcPr>
-            <w:tcW w:type="dxa" w:w="3702"/>
+            <w:tcW w:type="dxa" w:w="3767"/>
             <w:gridSpan w:val="3"/>
             <w:shd w:val="clear" w:color="auto" w:fill="F2F2F2"/>
           </w:tcPr>
@@ -418,7 +419,7 @@
         </w:tc>
         <w:tc>
           <w:tcPr>
-            <w:tcW w:type="dxa" w:w="1234"/>
+            <w:tcW w:type="dxa" w:w="1096"/>
             <w:vMerge w:val="restart"/>
             <w:vAlign w:val="center"/>
             <w:shd w:val="clear" w:color="auto" w:fill="F2F2F2"/>
@@ -441,28 +442,28 @@
       <w:tr>
         <w:tc>
           <w:tcPr>
-            <w:tcW w:type="dxa" w:w="1234"/>
+            <w:tcW w:type="dxa" w:w="1104"/>
             <w:vMerge/>
           </w:tcPr>
           <w:p/>
         </w:tc>
         <w:tc>
           <w:tcPr>
-            <w:tcW w:type="dxa" w:w="1234"/>
+            <w:tcW w:type="dxa" w:w="2087"/>
             <w:vMerge/>
           </w:tcPr>
           <w:p/>
         </w:tc>
         <w:tc>
           <w:tcPr>
-            <w:tcW w:type="dxa" w:w="1234"/>
+            <w:tcW w:type="dxa" w:w="972"/>
             <w:vMerge/>
           </w:tcPr>
           <w:p/>
         </w:tc>
         <w:tc>
           <w:tcPr>
-            <w:tcW w:type="dxa" w:w="1234"/>
+            <w:tcW w:type="dxa" w:w="973"/>
             <w:shd w:val="clear" w:color="auto" w:fill="F2F2F2"/>
           </w:tcPr>
           <w:p>
@@ -481,7 +482,7 @@
         </w:tc>
         <w:tc>
           <w:tcPr>
-            <w:tcW w:type="dxa" w:w="1234"/>
+            <w:tcW w:type="dxa" w:w="1265"/>
             <w:shd w:val="clear" w:color="auto" w:fill="F2F2F2"/>
           </w:tcPr>
           <w:p>
@@ -500,7 +501,7 @@
         </w:tc>
         <w:tc>
           <w:tcPr>
-            <w:tcW w:type="dxa" w:w="1234"/>
+            <w:tcW w:type="dxa" w:w="1529"/>
             <w:shd w:val="clear" w:color="auto" w:fill="F2F2F2"/>
           </w:tcPr>
           <w:p>
@@ -519,7 +520,7 @@
         </w:tc>
         <w:tc>
           <w:tcPr>
-            <w:tcW w:type="dxa" w:w="1234"/>
+            <w:tcW w:type="dxa" w:w="1096"/>
             <w:vMerge/>
           </w:tcPr>
           <w:p/>
@@ -528,7 +529,7 @@
       <w:tr>
         <w:tc>
           <w:tcPr>
-            <w:tcW w:type="dxa" w:w="1234"/>
+            <w:tcW w:type="dxa" w:w="1104"/>
           </w:tcPr>
           <w:p>
             <w:pPr>
@@ -546,7 +547,7 @@
         </w:tc>
         <w:tc>
           <w:tcPr>
-            <w:tcW w:type="dxa" w:w="1234"/>
+            <w:tcW w:type="dxa" w:w="2087"/>
           </w:tcPr>
           <w:p>
             <w:r/>
@@ -561,7 +562,7 @@
         </w:tc>
         <w:tc>
           <w:tcPr>
-            <w:tcW w:type="dxa" w:w="1234"/>
+            <w:tcW w:type="dxa" w:w="972"/>
           </w:tcPr>
           <w:p>
             <w:pPr>
@@ -580,7 +581,7 @@
         </w:tc>
         <w:tc>
           <w:tcPr>
-            <w:tcW w:type="dxa" w:w="1234"/>
+            <w:tcW w:type="dxa" w:w="973"/>
           </w:tcPr>
           <w:p>
             <w:pPr>
@@ -599,7 +600,7 @@
         </w:tc>
         <w:tc>
           <w:tcPr>
-            <w:tcW w:type="dxa" w:w="1234"/>
+            <w:tcW w:type="dxa" w:w="1265"/>
           </w:tcPr>
           <w:p>
             <w:pPr>
@@ -618,7 +619,7 @@
         </w:tc>
         <w:tc>
           <w:tcPr>
-            <w:tcW w:type="dxa" w:w="1234"/>
+            <w:tcW w:type="dxa" w:w="1529"/>
           </w:tcPr>
           <w:p>
             <w:pPr>
@@ -637,7 +638,7 @@
         </w:tc>
         <w:tc>
           <w:tcPr>
-            <w:tcW w:type="dxa" w:w="1234"/>
+            <w:tcW w:type="dxa" w:w="1096"/>
           </w:tcPr>
           <w:p>
             <w:pPr>
@@ -658,7 +659,7 @@
       <w:tr>
         <w:tc>
           <w:tcPr>
-            <w:tcW w:type="dxa" w:w="8638"/>
+            <w:tcW w:type="dxa" w:w="9026"/>
             <w:gridSpan w:val="7"/>
             <w:shd w:val="clear" w:color="auto" w:fill="D9D9D9"/>
           </w:tcPr>
@@ -680,7 +681,7 @@
       <w:tr>
         <w:tc>
           <w:tcPr>
-            <w:tcW w:type="dxa" w:w="8638"/>
+            <w:tcW w:type="dxa" w:w="9026"/>
             <w:gridSpan w:val="7"/>
           </w:tcPr>
           <w:p>
@@ -699,7 +700,7 @@
       <w:tr>
         <w:tc>
           <w:tcPr>
-            <w:tcW w:type="dxa" w:w="8638"/>
+            <w:tcW w:type="dxa" w:w="9026"/>
             <w:gridSpan w:val="7"/>
           </w:tcPr>
           <w:p>
@@ -712,7 +713,7 @@
       <w:tr>
         <w:tc>
           <w:tcPr>
-            <w:tcW w:type="dxa" w:w="8638"/>
+            <w:tcW w:type="dxa" w:w="9026"/>
             <w:gridSpan w:val="7"/>
           </w:tcPr>
           <w:p>
@@ -730,7 +731,7 @@
       <w:tr>
         <w:tc>
           <w:tcPr>
-            <w:tcW w:type="dxa" w:w="3702"/>
+            <w:tcW w:type="dxa" w:w="4163"/>
             <w:gridSpan w:val="3"/>
           </w:tcPr>
           <w:p>
@@ -749,7 +750,7 @@
         </w:tc>
         <w:tc>
           <w:tcPr>
-            <w:tcW w:type="dxa" w:w="2468"/>
+            <w:tcW w:type="dxa" w:w="2238"/>
             <w:gridSpan w:val="2"/>
           </w:tcPr>
           <w:p>
@@ -768,7 +769,7 @@
         </w:tc>
         <w:tc>
           <w:tcPr>
-            <w:tcW w:type="dxa" w:w="2468"/>
+            <w:tcW w:type="dxa" w:w="2625"/>
             <w:gridSpan w:val="2"/>
           </w:tcPr>
           <w:p>
@@ -789,7 +790,7 @@
       <w:tr>
         <w:tc>
           <w:tcPr>
-            <w:tcW w:type="dxa" w:w="8638"/>
+            <w:tcW w:type="dxa" w:w="9026"/>
             <w:gridSpan w:val="7"/>
           </w:tcPr>
           <w:p>
@@ -802,7 +803,7 @@
       <w:tr>
         <w:tc>
           <w:tcPr>
-            <w:tcW w:type="dxa" w:w="3702"/>
+            <w:tcW w:type="dxa" w:w="4163"/>
             <w:gridSpan w:val="3"/>
           </w:tcPr>
           <w:p>
@@ -818,7 +819,7 @@
         </w:tc>
         <w:tc>
           <w:tcPr>
-            <w:tcW w:type="dxa" w:w="2468"/>
+            <w:tcW w:type="dxa" w:w="2238"/>
             <w:gridSpan w:val="2"/>
           </w:tcPr>
           <w:p>
@@ -835,7 +836,7 @@
         </w:tc>
         <w:tc>
           <w:tcPr>
-            <w:tcW w:type="dxa" w:w="2468"/>
+            <w:tcW w:type="dxa" w:w="2625"/>
             <w:gridSpan w:val="2"/>
           </w:tcPr>
           <w:p>
@@ -854,7 +855,7 @@
       <w:tr>
         <w:tc>
           <w:tcPr>
-            <w:tcW w:type="dxa" w:w="8638"/>
+            <w:tcW w:type="dxa" w:w="9026"/>
             <w:gridSpan w:val="7"/>
           </w:tcPr>
           <w:p>
@@ -867,7 +868,7 @@
       <w:tr>
         <w:tc>
           <w:tcPr>
-            <w:tcW w:type="dxa" w:w="8638"/>
+            <w:tcW w:type="dxa" w:w="9026"/>
             <w:gridSpan w:val="7"/>
           </w:tcPr>
           <w:p>
@@ -880,7 +881,7 @@
       <w:tr>
         <w:tc>
           <w:tcPr>
-            <w:tcW w:type="dxa" w:w="8638"/>
+            <w:tcW w:type="dxa" w:w="9026"/>
             <w:gridSpan w:val="7"/>
           </w:tcPr>
           <w:p>
@@ -893,7 +894,7 @@
       <w:tr>
         <w:tc>
           <w:tcPr>
-            <w:tcW w:type="dxa" w:w="8638"/>
+            <w:tcW w:type="dxa" w:w="9026"/>
             <w:gridSpan w:val="7"/>
           </w:tcPr>
           <w:p>
@@ -911,7 +912,7 @@
       <w:tr>
         <w:tc>
           <w:tcPr>
-            <w:tcW w:type="dxa" w:w="4936"/>
+            <w:tcW w:type="dxa" w:w="5136"/>
             <w:gridSpan w:val="4"/>
           </w:tcPr>
           <w:p>
@@ -930,7 +931,7 @@
         </w:tc>
         <w:tc>
           <w:tcPr>
-            <w:tcW w:type="dxa" w:w="2468"/>
+            <w:tcW w:type="dxa" w:w="2794"/>
             <w:gridSpan w:val="2"/>
           </w:tcPr>
           <w:p>
@@ -949,7 +950,7 @@
         </w:tc>
         <w:tc>
           <w:tcPr>
-            <w:tcW w:type="dxa" w:w="1234"/>
+            <w:tcW w:type="dxa" w:w="1096"/>
           </w:tcPr>
           <w:p>
             <w:pPr>
@@ -969,7 +970,7 @@
       <w:tr>
         <w:tc>
           <w:tcPr>
-            <w:tcW w:type="dxa" w:w="4936"/>
+            <w:tcW w:type="dxa" w:w="5136"/>
             <w:gridSpan w:val="4"/>
           </w:tcPr>
           <w:p>
@@ -986,7 +987,7 @@
         </w:tc>
         <w:tc>
           <w:tcPr>
-            <w:tcW w:type="dxa" w:w="2468"/>
+            <w:tcW w:type="dxa" w:w="2794"/>
             <w:gridSpan w:val="2"/>
           </w:tcPr>
           <w:p>
@@ -1003,7 +1004,7 @@
         </w:tc>
         <w:tc>
           <w:tcPr>
-            <w:tcW w:type="dxa" w:w="1234"/>
+            <w:tcW w:type="dxa" w:w="1096"/>
           </w:tcPr>
           <w:p>
             <w:r/>
@@ -1021,7 +1022,7 @@
       <w:tr>
         <w:tc>
           <w:tcPr>
-            <w:tcW w:type="dxa" w:w="8638"/>
+            <w:tcW w:type="dxa" w:w="9026"/>
             <w:gridSpan w:val="7"/>
           </w:tcPr>
           <w:p>
@@ -1034,7 +1035,7 @@
       <w:tr>
         <w:tc>
           <w:tcPr>
-            <w:tcW w:type="dxa" w:w="8638"/>
+            <w:tcW w:type="dxa" w:w="9026"/>
             <w:gridSpan w:val="7"/>
           </w:tcPr>
           <w:p>
@@ -1047,7 +1048,7 @@
       <w:tr>
         <w:tc>
           <w:tcPr>
-            <w:tcW w:type="dxa" w:w="8638"/>
+            <w:tcW w:type="dxa" w:w="9026"/>
             <w:gridSpan w:val="7"/>
           </w:tcPr>
           <w:p>
@@ -1065,7 +1066,7 @@
       <w:tr>
         <w:tc>
           <w:tcPr>
-            <w:tcW w:type="dxa" w:w="8638"/>
+            <w:tcW w:type="dxa" w:w="9026"/>
             <w:gridSpan w:val="7"/>
           </w:tcPr>
           <w:p>
@@ -1078,7 +1079,7 @@
       <w:tr>
         <w:tc>
           <w:tcPr>
-            <w:tcW w:type="dxa" w:w="8638"/>
+            <w:tcW w:type="dxa" w:w="9026"/>
             <w:gridSpan w:val="7"/>
           </w:tcPr>
           <w:p>
@@ -1104,7 +1105,7 @@
       <w:tr>
         <w:tc>
           <w:tcPr>
-            <w:tcW w:type="dxa" w:w="8638"/>
+            <w:tcW w:type="dxa" w:w="9026"/>
             <w:gridSpan w:val="7"/>
           </w:tcPr>
           <w:p>
@@ -1130,7 +1131,7 @@
       <w:tr>
         <w:tc>
           <w:tcPr>
-            <w:tcW w:type="dxa" w:w="4936"/>
+            <w:tcW w:type="dxa" w:w="5136"/>
             <w:gridSpan w:val="4"/>
           </w:tcPr>
           <w:p>
@@ -1156,7 +1157,7 @@
         </w:tc>
         <w:tc>
           <w:tcPr>
-            <w:tcW w:type="dxa" w:w="3702"/>
+            <w:tcW w:type="dxa" w:w="3890"/>
             <w:gridSpan w:val="3"/>
           </w:tcPr>
           <w:p>
@@ -1203,7 +1204,7 @@
       <w:tr>
         <w:tc>
           <w:tcPr>
-            <w:tcW w:type="dxa" w:w="8638"/>
+            <w:tcW w:type="dxa" w:w="9026"/>
             <w:gridSpan w:val="7"/>
             <w:shd w:val="clear" w:color="auto" w:fill="D9D9D9"/>
           </w:tcPr>
@@ -1225,7 +1226,7 @@
       <w:tr>
         <w:tc>
           <w:tcPr>
-            <w:tcW w:type="dxa" w:w="8638"/>
+            <w:tcW w:type="dxa" w:w="9026"/>
             <w:gridSpan w:val="7"/>
           </w:tcPr>
           <w:p>
@@ -1277,7 +1278,7 @@
       <w:tr>
         <w:tc>
           <w:tcPr>
-            <w:tcW w:type="dxa" w:w="8638"/>
+            <w:tcW w:type="dxa" w:w="9026"/>
             <w:gridSpan w:val="7"/>
           </w:tcPr>
           <w:p>
@@ -1306,7 +1307,7 @@
       <w:tr>
         <w:tc>
           <w:tcPr>
-            <w:tcW w:type="dxa" w:w="8638"/>
+            <w:tcW w:type="dxa" w:w="9026"/>
             <w:gridSpan w:val="7"/>
           </w:tcPr>
           <w:p>
@@ -1335,7 +1336,7 @@
       <w:tr>
         <w:tc>
           <w:tcPr>
-            <w:tcW w:type="dxa" w:w="8638"/>
+            <w:tcW w:type="dxa" w:w="9026"/>
             <w:gridSpan w:val="7"/>
           </w:tcPr>
           <w:p>
@@ -1391,18 +1392,18 @@
     <w:p/>
     <w:tbl>
       <w:tblPr>
-        <w:tblW w:type="auto" w:w="0"/>
-        <w:tblLayout w:type="autofit"/>
+        <w:tblW w:type="dxa" w:w="9026"/>
+        <w:tblLayout w:type="fixed"/>
         <w:tblLook w:firstColumn="1" w:firstRow="1" w:lastColumn="0" w:lastRow="0" w:noHBand="0" w:noVBand="1" w:val="04A0"/>
       </w:tblPr>
       <w:tblGrid>
-        <w:gridCol w:w="4320"/>
-        <w:gridCol w:w="4320"/>
+        <w:gridCol w:w="4513"/>
+        <w:gridCol w:w="4513"/>
       </w:tblGrid>
       <w:tr>
         <w:tc>
           <w:tcPr>
-            <w:tcW w:type="dxa" w:w="4320"/>
+            <w:tcW w:type="dxa" w:w="4513"/>
           </w:tcPr>
           <w:p>
             <w:pPr>
@@ -1420,7 +1421,7 @@
         </w:tc>
         <w:tc>
           <w:tcPr>
-            <w:tcW w:type="dxa" w:w="4320"/>
+            <w:tcW w:type="dxa" w:w="4513"/>
           </w:tcPr>
           <w:p>
             <w:pPr>
@@ -1441,7 +1442,7 @@
       <w:tr>
         <w:tc>
           <w:tcPr>
-            <w:tcW w:type="dxa" w:w="4320"/>
+            <w:tcW w:type="dxa" w:w="4513"/>
           </w:tcPr>
           <w:p>
             <w:pPr>
@@ -1474,7 +1475,7 @@
         </w:tc>
         <w:tc>
           <w:tcPr>
-            <w:tcW w:type="dxa" w:w="4320"/>
+            <w:tcW w:type="dxa" w:w="4513"/>
           </w:tcPr>
           <w:p>
             <w:pPr>
@@ -1509,7 +1510,7 @@
       <w:tr>
         <w:tc>
           <w:tcPr>
-            <w:tcW w:type="dxa" w:w="4320"/>
+            <w:tcW w:type="dxa" w:w="4513"/>
           </w:tcPr>
           <w:p>
             <w:pPr>
@@ -1528,7 +1529,7 @@
         </w:tc>
         <w:tc>
           <w:tcPr>
-            <w:tcW w:type="dxa" w:w="4320"/>
+            <w:tcW w:type="dxa" w:w="4513"/>
           </w:tcPr>
           <w:p>
             <w:pPr>
@@ -1548,8 +1549,8 @@
       </w:tr>
     </w:tbl>
     <w:sectPr>
-      <w:pgSz w:w="12240" w:h="15840"/>
-      <w:pgMar w:top="1440" w:right="1800" w:bottom="1440" w:left="1800" w:header="720" w:footer="720" w:gutter="0"/>
+      <w:pgSz w:h="16838" w:w="11906" w:orient="portrait"/>
+      <w:pgMar w:bottom="1135" w:top="851" w:left="1440" w:right="1440" w:header="708" w:footer="708"/>
       <w:cols w:space="720"/>
       <w:docGrid w:linePitch="360"/>
     </w:sectPr>

</xml_diff>